<commit_message>
finished design section 5
</commit_message>
<xml_diff>
--- a/Design/(4) playstyle_classification.docx
+++ b/Design/(4) playstyle_classification.docx
@@ -22,15 +22,11 @@
       </w:r>
     </w:p>
     <w:p>
-      <w:pPr>
-        <w:rPr>
-          <w:b/>
-          <w:bCs/>
-          <w:sz w:val="28"/>
-          <w:szCs w:val="28"/>
-        </w:rPr>
-      </w:pPr>
+      <w:r>
+        <w:t>The overall goal of this section is to provide the user a label to their average statistics and using that to help explain potential patterns and flaws in their gameplay that they can learn from. Due to the unfortunate reality that a playstyle is ultimately a subjective classification of a player’s attributes, it may not directly align with what the user thought they would have, though to mitigate this issue, the focus will be on providing reason for the classification and highlighting potential flaws through statistics, so even if the “playstyle” itself does not match the user’s opinion, the user can learn from data paired with justification.</w:t>
+      </w:r>
     </w:p>
+    <w:p/>
     <w:p>
       <w:pPr>
         <w:rPr>
@@ -464,6 +460,20 @@
       <w:r>
         <w:t>.</w:t>
       </w:r>
+      <w:r>
+        <w:t xml:space="preserve"> By specifying which statistics will be most impactful as features with justification, I will meet </w:t>
+      </w:r>
+      <w:r>
+        <w:rPr>
+          <w:b/>
+          <w:bCs/>
+          <w:u w:val="single"/>
+        </w:rPr>
+        <w:t>Requirement 2.3.1</w:t>
+      </w:r>
+      <w:r>
+        <w:t>.</w:t>
+      </w:r>
     </w:p>
     <w:p>
       <w:r>
@@ -510,7 +520,11 @@
         <w:t>Freestyler</w:t>
       </w:r>
       <w:r>
-        <w:t xml:space="preserve"> is a player who takes many opportunities to perform a highly mechanical play, typically high in the air, in order to outplay the opponents and score themselves, though in higher level lobbies, these plays can also end up being intentional assists. That is why a Freestyler would typically spend more time high in the air, and less time on the ground than most players, and in many ranks, prioritising these flashy plays over other important aspects of the game, such as passing, saving, and dribbling.</w:t>
+        <w:t xml:space="preserve"> is a player who takes many opportunities to perform a highly mechanical play, typically high in the air, in order to outplay the opponents and score themselves, though in higher level lobbies, these plays can also end up being intentional assists. That is why a Freestyler would typically </w:t>
+      </w:r>
+      <w:r>
+        <w:lastRenderedPageBreak/>
+        <w:t>spend more time high in the air, and less time on the ground than most players, and in many ranks, prioritising these flashy plays over other important aspects of the game, such as passing, saving, and dribbling.</w:t>
       </w:r>
     </w:p>
     <w:p>
@@ -530,7 +544,6 @@
     </w:p>
     <w:p>
       <w:r>
-        <w:lastRenderedPageBreak/>
         <w:t xml:space="preserve">A </w:t>
       </w:r>
       <w:r>
@@ -601,7 +614,6 @@
       <w:r>
         <w:t xml:space="preserve">The model I have chosen to use from scikit-learn is </w:t>
       </w:r>
-      <w:proofErr w:type="spellStart"/>
       <w:r>
         <w:rPr>
           <w:b/>
@@ -609,7 +621,6 @@
         </w:rPr>
         <w:t>RandomForestClassifier</w:t>
       </w:r>
-      <w:proofErr w:type="spellEnd"/>
       <w:r>
         <w:t xml:space="preserve">, some of the most important reasons for this choice outside of its reliability and resistance to overfitting, include </w:t>
       </w:r>
@@ -647,15 +658,7 @@
     </w:p>
     <w:p>
       <w:r>
-        <w:t xml:space="preserve">Another important aspect is Random Forest’s hierarchal design, which is important in the case that the “Rank” feature will be very significant in its effect on every other feature, </w:t>
-      </w:r>
-      <w:proofErr w:type="spellStart"/>
-      <w:r>
-        <w:t>i.e</w:t>
-      </w:r>
-      <w:proofErr w:type="spellEnd"/>
-      <w:r>
-        <w:t>: time spent high in air indicates freestyler in Diamond much more heavily than in Grand Champ. Its hierarchal design allows for the Rank feature to be near the root of the tree, and therefore accurately demonstrate its significance in the classification of the user’s playstyle.</w:t>
+        <w:t>Another important aspect is Random Forest’s hierarchal design, which is important in the case that the “Rank” feature will be very significant in its effect on every other feature, i.e: time spent high in air indicates freestyler in Diamond much more heavily than in Grand Champ. Its hierarchal design allows for the Rank feature to be near the root of the tree, and therefore accurately demonstrate its significance in the classification of the user’s playstyle.</w:t>
       </w:r>
     </w:p>
     <w:p/>
@@ -676,6 +679,22 @@
           <w:szCs w:val="24"/>
         </w:rPr>
         <w:t>4.3 Advice</w:t>
+      </w:r>
+    </w:p>
+    <w:p>
+      <w:r>
+        <w:t xml:space="preserve">Each flaw mentioned in the interviews was used in order to derive suitable advice, meeting </w:t>
+      </w:r>
+      <w:r>
+        <w:rPr>
+          <w:b/>
+          <w:bCs/>
+          <w:u w:val="single"/>
+        </w:rPr>
+        <w:t>Requirement 1.3.6</w:t>
+      </w:r>
+      <w:r>
+        <w:t>.</w:t>
       </w:r>
     </w:p>
     <w:p>
@@ -721,7 +740,7 @@
                 <w:b/>
                 <w:bCs/>
               </w:rPr>
-              <w:t>Issue</w:t>
+              <w:t>Flaw</w:t>
             </w:r>
           </w:p>
         </w:tc>
@@ -773,6 +792,7 @@
           </w:tcPr>
           <w:p>
             <w:r>
+              <w:lastRenderedPageBreak/>
               <w:t>Not back to defend (</w:t>
             </w:r>
             <w:r>
@@ -917,7 +937,7 @@
                 <w:b/>
                 <w:bCs/>
               </w:rPr>
-              <w:t>Issue</w:t>
+              <w:t>Flaw</w:t>
             </w:r>
           </w:p>
         </w:tc>
@@ -969,7 +989,6 @@
           </w:tcPr>
           <w:p>
             <w:r>
-              <w:lastRenderedPageBreak/>
               <w:t>Overcommitting</w:t>
             </w:r>
             <w:r>
@@ -1085,7 +1104,7 @@
                 <w:b/>
                 <w:bCs/>
               </w:rPr>
-              <w:t>Issue</w:t>
+              <w:t>Flaw</w:t>
             </w:r>
           </w:p>
         </w:tc>
@@ -1188,10 +1207,7 @@
           </w:tcPr>
           <w:p>
             <w:r>
-              <w:t>Going for a too many high-risk plays where you end up 0 boost in the offensive third, not able to get back to defence in time.</w:t>
-            </w:r>
-            <w:r>
-              <w:t xml:space="preserve"> </w:t>
+              <w:t xml:space="preserve">Going for a too many high-risk plays where you end up 0 boost in the offensive third, not able to get back to defence in time. </w:t>
             </w:r>
           </w:p>
         </w:tc>
@@ -1291,7 +1307,7 @@
                 <w:b/>
                 <w:bCs/>
               </w:rPr>
-              <w:t>Issue</w:t>
+              <w:t>Flaw</w:t>
             </w:r>
           </w:p>
         </w:tc>
@@ -1363,10 +1379,7 @@
           </w:tcPr>
           <w:p>
             <w:r>
-              <w:t>Trying to take time too often can also be an issue, can lead to unfavourable 50/50’s and giving away possession in your own half.</w:t>
-            </w:r>
-            <w:r>
-              <w:t xml:space="preserve"> </w:t>
+              <w:t xml:space="preserve">Trying to take time too often can also be an issue, can lead to unfavourable 50/50’s and giving away possession in your own half. </w:t>
             </w:r>
           </w:p>
         </w:tc>
@@ -1469,7 +1482,7 @@
                 <w:b/>
                 <w:bCs/>
               </w:rPr>
-              <w:t>Issue</w:t>
+              <w:t>Flaw</w:t>
             </w:r>
           </w:p>
         </w:tc>
@@ -1521,7 +1534,11 @@
           </w:tcPr>
           <w:p>
             <w:r>
-              <w:t>Causing double commits by breaking rotation (</w:t>
+              <w:t xml:space="preserve">Causing double commits by </w:t>
+            </w:r>
+            <w:r>
+              <w:lastRenderedPageBreak/>
+              <w:t>breaking rotation (</w:t>
             </w:r>
             <w:r>
               <w:rPr>
@@ -1541,10 +1558,12 @@
           </w:tcPr>
           <w:p>
             <w:r>
-              <w:t xml:space="preserve">Ensure when chasing the ball that your teammates don’t have a better play on it, or clearly intend to go for it, to avoid causing double commits or suboptimal plays. </w:t>
-            </w:r>
-            <w:r>
-              <w:t xml:space="preserve"> </w:t>
+              <w:lastRenderedPageBreak/>
+              <w:t xml:space="preserve">Ensure when chasing the ball that your teammates don’t have a better play on it, or clearly intend to </w:t>
+            </w:r>
+            <w:r>
+              <w:lastRenderedPageBreak/>
+              <w:t xml:space="preserve">go for it, to avoid causing double commits or suboptimal plays.  </w:t>
             </w:r>
           </w:p>
         </w:tc>
@@ -1554,6 +1573,7 @@
           </w:tcPr>
           <w:p>
             <w:r>
+              <w:lastRenderedPageBreak/>
               <w:t>Low average distance to teammates</w:t>
             </w:r>
           </w:p>
@@ -1649,7 +1669,7 @@
                 <w:b/>
                 <w:bCs/>
               </w:rPr>
-              <w:t>Issue</w:t>
+              <w:t>Flaw</w:t>
             </w:r>
           </w:p>
         </w:tc>
@@ -1701,11 +1721,7 @@
           </w:tcPr>
           <w:p>
             <w:r>
-              <w:t xml:space="preserve">Not involved in offensive plays </w:t>
-            </w:r>
-            <w:r>
-              <w:lastRenderedPageBreak/>
-              <w:t>enough (</w:t>
+              <w:t>Not involved in offensive plays enough (</w:t>
             </w:r>
             <w:r>
               <w:rPr>
@@ -1725,15 +1741,7 @@
           </w:tcPr>
           <w:p>
             <w:r>
-              <w:lastRenderedPageBreak/>
-              <w:t xml:space="preserve">By rotating back too early on offensive plays, you can miss chances to let your first man cover clears and allow you to become </w:t>
-            </w:r>
-            <w:r>
-              <w:lastRenderedPageBreak/>
-              <w:t>involved in supporting the attack and maintaining pressure.</w:t>
-            </w:r>
-            <w:r>
-              <w:t xml:space="preserve"> </w:t>
+              <w:t xml:space="preserve">By rotating back too early on offensive plays, you can miss chances to let your first man cover clears and allow you to become involved in supporting the attack and maintaining pressure. </w:t>
             </w:r>
           </w:p>
         </w:tc>
@@ -1743,7 +1751,6 @@
           </w:tcPr>
           <w:p>
             <w:r>
-              <w:lastRenderedPageBreak/>
               <w:t>High % time in defensive third, high average distance from ball</w:t>
             </w:r>
           </w:p>
@@ -1833,7 +1840,7 @@
                 <w:b/>
                 <w:bCs/>
               </w:rPr>
-              <w:t>Issue</w:t>
+              <w:t>Flaw</w:t>
             </w:r>
           </w:p>
         </w:tc>
@@ -2002,7 +2009,248 @@
         <w:t>4.4 Labelling strategies</w:t>
       </w:r>
     </w:p>
-    <w:p/>
+    <w:p>
+      <w:r>
+        <w:t xml:space="preserve">For the model to be able to learn to classify the data, the data must somehow be labelled. However, since the classification of a playstyle is ultimately a subjective decision based on tendencies and statistics, the only realistic way to acquire these labels is to do so manually. This part will explain the details of how I will aim to do so to meet </w:t>
+      </w:r>
+      <w:r>
+        <w:rPr>
+          <w:b/>
+          <w:bCs/>
+          <w:u w:val="single"/>
+        </w:rPr>
+        <w:t>Requirement 1.3.3</w:t>
+      </w:r>
+      <w:r>
+        <w:t xml:space="preserve">, while trying to achieve the highest accuracy possible </w:t>
+      </w:r>
+      <w:r>
+        <w:t>to</w:t>
+      </w:r>
+      <w:r>
+        <w:t xml:space="preserve"> align with </w:t>
+      </w:r>
+      <w:r>
+        <w:rPr>
+          <w:b/>
+          <w:bCs/>
+          <w:u w:val="single"/>
+        </w:rPr>
+        <w:t>Requirement 2.3.2</w:t>
+      </w:r>
+      <w:r>
+        <w:t>.</w:t>
+      </w:r>
+    </w:p>
+    <w:p>
+      <w:r>
+        <w:t>To make this process as quick as possible</w:t>
+      </w:r>
+      <w:r>
+        <w:t xml:space="preserve"> (as to allow for as much training data as possible)</w:t>
+      </w:r>
+      <w:r>
+        <w:t xml:space="preserve">, I aim to create a </w:t>
+      </w:r>
+      <w:r>
+        <w:rPr>
+          <w:b/>
+          <w:bCs/>
+        </w:rPr>
+        <w:t>mini application</w:t>
+      </w:r>
+      <w:r>
+        <w:t xml:space="preserve"> </w:t>
+      </w:r>
+      <w:r>
+        <w:t xml:space="preserve">(labeller) </w:t>
+      </w:r>
+      <w:r>
+        <w:t xml:space="preserve">that allows me to analyse relevant statistics of a single player, and simply click the button corresponding to the </w:t>
+      </w:r>
+      <w:r>
+        <w:t>playstyle I decide, in order</w:t>
+      </w:r>
+      <w:r>
+        <w:t xml:space="preserve"> remove the need to write it down manually and read the data in an unintuitive spreadsheet.</w:t>
+      </w:r>
+    </w:p>
+    <w:p>
+      <w:r>
+        <w:t xml:space="preserve">Due to the high amount of data that will need to be analysed, it will be difficult for me to judge a set of values until I have seen many and built up a general understanding of how an average player’s </w:t>
+      </w:r>
+      <w:r>
+        <w:rPr>
+          <w:noProof/>
+        </w:rPr>
+        <w:lastRenderedPageBreak/>
+        <w:drawing>
+          <wp:anchor distT="0" distB="0" distL="114300" distR="114300" simplePos="0" relativeHeight="251658240" behindDoc="0" locked="0" layoutInCell="1" allowOverlap="1" wp14:anchorId="44FB4FD3" wp14:editId="6AEF2DF3">
+            <wp:simplePos x="0" y="0"/>
+            <wp:positionH relativeFrom="margin">
+              <wp:align>right</wp:align>
+            </wp:positionH>
+            <wp:positionV relativeFrom="paragraph">
+              <wp:posOffset>0</wp:posOffset>
+            </wp:positionV>
+            <wp:extent cx="2322830" cy="1857375"/>
+            <wp:effectExtent l="0" t="0" r="0" b="0"/>
+            <wp:wrapSquare wrapText="bothSides"/>
+            <wp:docPr id="73343619" name="Picture 2" descr="Finding and Using Health Statistics"/>
+            <wp:cNvGraphicFramePr>
+              <a:graphicFrameLocks xmlns:a="http://schemas.openxmlformats.org/drawingml/2006/main" noChangeAspect="1"/>
+            </wp:cNvGraphicFramePr>
+            <a:graphic xmlns:a="http://schemas.openxmlformats.org/drawingml/2006/main">
+              <a:graphicData uri="http://schemas.openxmlformats.org/drawingml/2006/picture">
+                <pic:pic xmlns:pic="http://schemas.openxmlformats.org/drawingml/2006/picture">
+                  <pic:nvPicPr>
+                    <pic:cNvPr id="0" name="Picture 2" descr="Finding and Using Health Statistics"/>
+                    <pic:cNvPicPr>
+                      <a:picLocks noChangeAspect="1" noChangeArrowheads="1"/>
+                    </pic:cNvPicPr>
+                  </pic:nvPicPr>
+                  <pic:blipFill>
+                    <a:blip r:embed="rId5" cstate="print">
+                      <a:extLst>
+                        <a:ext uri="{28A0092B-C50C-407E-A947-70E740481C1C}">
+                          <a14:useLocalDpi xmlns:a14="http://schemas.microsoft.com/office/drawing/2010/main" val="0"/>
+                        </a:ext>
+                      </a:extLst>
+                    </a:blip>
+                    <a:srcRect/>
+                    <a:stretch>
+                      <a:fillRect/>
+                    </a:stretch>
+                  </pic:blipFill>
+                  <pic:spPr bwMode="auto">
+                    <a:xfrm>
+                      <a:off x="0" y="0"/>
+                      <a:ext cx="2322830" cy="1857375"/>
+                    </a:xfrm>
+                    <a:prstGeom prst="rect">
+                      <a:avLst/>
+                    </a:prstGeom>
+                    <a:noFill/>
+                    <a:ln>
+                      <a:noFill/>
+                    </a:ln>
+                  </pic:spPr>
+                </pic:pic>
+              </a:graphicData>
+            </a:graphic>
+            <wp14:sizeRelH relativeFrom="margin">
+              <wp14:pctWidth>0</wp14:pctWidth>
+            </wp14:sizeRelH>
+            <wp14:sizeRelV relativeFrom="margin">
+              <wp14:pctHeight>0</wp14:pctHeight>
+            </wp14:sizeRelV>
+          </wp:anchor>
+        </w:drawing>
+      </w:r>
+      <w:r>
+        <w:t>specific statistic should look like</w:t>
+      </w:r>
+      <w:r>
+        <w:t xml:space="preserve">. This would be an unreliable and extremely difficult solution to attempt to accurately label hundreds of players of different ranks. To tackle this problem, I have decided to take advantage of a </w:t>
+      </w:r>
+      <w:r>
+        <w:rPr>
+          <w:b/>
+          <w:bCs/>
+        </w:rPr>
+        <w:t>Gaussian/Normal Distribution</w:t>
+      </w:r>
+      <w:r>
+        <w:t xml:space="preserve"> so that when analysing a set of data in the labeller, I can compare </w:t>
+      </w:r>
+      <w:r>
+        <w:rPr>
+          <w:b/>
+          <w:bCs/>
+        </w:rPr>
+        <w:t>percentiles</w:t>
+      </w:r>
+      <w:r>
+        <w:t>, which are naturally associated with the entire dataset, and therefore allows me to objectively compare a player with the rest of their rank. This paired with the actual values will make labelling as quick and accurate as possible.</w:t>
+      </w:r>
+      <w:r>
+        <w:t xml:space="preserve"> </w:t>
+      </w:r>
+    </w:p>
+    <w:p>
+      <w:r>
+        <w:t>The reason I think this distribution is suitable outside of its ability to compare all players at once, is that most of the statistics have an average value that most players will cluster around, and some statistics deviate only slightly from the average, yet make a big difference in a player’s playstyle, such as time spent high in the air, which will be taken into account with this distribution since it uses a calculated standard deviation to infer variation in data, so even small deviations from the average on sensitive data will be accurately represented using this distribution. An additional advantage of using this is its ease of application, by simply calculating the mean and standard deviation of each statistic in the dataset, and from that calculating the z-scores and from that the useful percentages.</w:t>
+      </w:r>
+    </w:p>
+    <w:p>
+      <w:r>
+        <w:t xml:space="preserve">The general idea can be visualised with the following image, with implementation including all specific statistics and playstyles. Note the bar with different colours is included to make judging the percentiles quicker and </w:t>
+      </w:r>
+      <w:r>
+        <w:t>easier but</w:t>
+      </w:r>
+      <w:r>
+        <w:t xml:space="preserve"> will only be implemented if the complexity and time required to do so do not outweigh the benefits.</w:t>
+      </w:r>
+      <w:r>
+        <w:t xml:space="preserve"> The “Statistic” in each box implies the name of the statistic and its actual value below it.</w:t>
+      </w:r>
+    </w:p>
+    <w:p>
+      <w:r>
+        <w:rPr>
+          <w:noProof/>
+        </w:rPr>
+        <w:drawing>
+          <wp:inline distT="0" distB="0" distL="0" distR="0" wp14:anchorId="215B7EF6" wp14:editId="2063600F">
+            <wp:extent cx="5724525" cy="2438400"/>
+            <wp:effectExtent l="0" t="0" r="9525" b="0"/>
+            <wp:docPr id="825056258" name="Picture 1"/>
+            <wp:cNvGraphicFramePr>
+              <a:graphicFrameLocks xmlns:a="http://schemas.openxmlformats.org/drawingml/2006/main" noChangeAspect="1"/>
+            </wp:cNvGraphicFramePr>
+            <a:graphic xmlns:a="http://schemas.openxmlformats.org/drawingml/2006/main">
+              <a:graphicData uri="http://schemas.openxmlformats.org/drawingml/2006/picture">
+                <pic:pic xmlns:pic="http://schemas.openxmlformats.org/drawingml/2006/picture">
+                  <pic:nvPicPr>
+                    <pic:cNvPr id="0" name="Picture 1"/>
+                    <pic:cNvPicPr>
+                      <a:picLocks noChangeAspect="1" noChangeArrowheads="1"/>
+                    </pic:cNvPicPr>
+                  </pic:nvPicPr>
+                  <pic:blipFill>
+                    <a:blip r:embed="rId6">
+                      <a:extLst>
+                        <a:ext uri="{28A0092B-C50C-407E-A947-70E740481C1C}">
+                          <a14:useLocalDpi xmlns:a14="http://schemas.microsoft.com/office/drawing/2010/main" val="0"/>
+                        </a:ext>
+                      </a:extLst>
+                    </a:blip>
+                    <a:srcRect/>
+                    <a:stretch>
+                      <a:fillRect/>
+                    </a:stretch>
+                  </pic:blipFill>
+                  <pic:spPr bwMode="auto">
+                    <a:xfrm>
+                      <a:off x="0" y="0"/>
+                      <a:ext cx="5724525" cy="2438400"/>
+                    </a:xfrm>
+                    <a:prstGeom prst="rect">
+                      <a:avLst/>
+                    </a:prstGeom>
+                    <a:noFill/>
+                    <a:ln>
+                      <a:noFill/>
+                    </a:ln>
+                  </pic:spPr>
+                </pic:pic>
+              </a:graphicData>
+            </a:graphic>
+          </wp:inline>
+        </w:drawing>
+      </w:r>
+    </w:p>
     <w:sectPr>
       <w:pgSz w:w="11906" w:h="16838"/>
       <w:pgMar w:top="1440" w:right="1440" w:bottom="1440" w:left="1440" w:header="708" w:footer="708" w:gutter="0"/>

</xml_diff>

<commit_message>
fixed data collection + labelled prototype data
</commit_message>
<xml_diff>
--- a/Design/(4) playstyle_classification.docx
+++ b/Design/(4) playstyle_classification.docx
@@ -141,6 +141,9 @@
             <w:r>
               <w:t>Goals scored to total goal ratio, Average shots per game, Shot to goal percentage</w:t>
             </w:r>
+            <w:r>
+              <w:t>, Time between players</w:t>
+            </w:r>
           </w:p>
         </w:tc>
         <w:tc>
@@ -342,6 +345,9 @@
             <w:r>
               <w:t>Possession time, Time spent supersonic speed</w:t>
             </w:r>
+            <w:r>
+              <w:t>, BPM</w:t>
+            </w:r>
           </w:p>
         </w:tc>
       </w:tr>
@@ -403,7 +409,13 @@
           </w:tcPr>
           <w:p>
             <w:r>
-              <w:t>Assists to total goal ratio, Time spent in neutral third, Time near wall</w:t>
+              <w:t xml:space="preserve">Assists to total goal ratio, </w:t>
+            </w:r>
+            <w:r>
+              <w:t>Time in front of ball</w:t>
+            </w:r>
+            <w:r>
+              <w:t>, Time most forward</w:t>
             </w:r>
           </w:p>
         </w:tc>
@@ -411,7 +423,11 @@
           <w:tcPr>
             <w:tcW w:w="3402" w:type="dxa"/>
           </w:tcPr>
-          <w:p/>
+          <w:p>
+            <w:r>
+              <w:t>Time spent in neutral third, Time near wall</w:t>
+            </w:r>
+          </w:p>
         </w:tc>
       </w:tr>
     </w:tbl>
@@ -520,11 +536,11 @@
         <w:t>Freestyler</w:t>
       </w:r>
       <w:r>
-        <w:t xml:space="preserve"> is a player who takes many opportunities to perform a highly mechanical play, typically high in the air, in order to outplay the opponents and score themselves, though in higher level lobbies, these plays can also end up being intentional assists. That is why a Freestyler would typically </w:t>
+        <w:t xml:space="preserve"> is a player who takes many opportunities to perform a highly mechanical play, typically high in the air, in order to outplay the opponents and score themselves, though in higher level </w:t>
       </w:r>
       <w:r>
         <w:lastRenderedPageBreak/>
-        <w:t>spend more time high in the air, and less time on the ground than most players, and in many ranks, prioritising these flashy plays over other important aspects of the game, such as passing, saving, and dribbling.</w:t>
+        <w:t>lobbies, these plays can also end up being intentional assists. That is why a Freestyler would typically spend more time high in the air, and less time on the ground than most players, and in many ranks, prioritising these flashy plays over other important aspects of the game, such as passing, saving, and dribbling.</w:t>
       </w:r>
     </w:p>
     <w:p>
@@ -614,7 +630,6 @@
       <w:r>
         <w:t xml:space="preserve">The model I have chosen to use from scikit-learn is </w:t>
       </w:r>
-      <w:proofErr w:type="spellStart"/>
       <w:r>
         <w:rPr>
           <w:b/>
@@ -622,7 +637,6 @@
         </w:rPr>
         <w:t>RandomForestClassifier</w:t>
       </w:r>
-      <w:proofErr w:type="spellEnd"/>
       <w:r>
         <w:t xml:space="preserve">, some of the most important reasons for this choice outside of its reliability and resistance to overfitting, include </w:t>
       </w:r>
@@ -660,15 +674,7 @@
     </w:p>
     <w:p>
       <w:r>
-        <w:t xml:space="preserve">Another important aspect is Random Forest’s hierarchal design, which is important in the case that the “Rank” feature will be very significant in its effect on every other feature, </w:t>
-      </w:r>
-      <w:proofErr w:type="spellStart"/>
-      <w:r>
-        <w:t>i.e</w:t>
-      </w:r>
-      <w:proofErr w:type="spellEnd"/>
-      <w:r>
-        <w:t>: time spent high in air indicates freestyler in Diamond much more heavily than in Grand Champ. Its hierarchal design allows for the Rank feature to be near the root of the tree, and therefore accurately demonstrate its significance in the classification of the user’s playstyle.</w:t>
+        <w:t>Another important aspect is Random Forest’s hierarchal design, which is important in the case that the “Rank” feature will be very significant in its effect on every other feature, i.e: time spent high in air indicates freestyler in Diamond much more heavily than in Grand Champ. Its hierarchal design allows for the Rank feature to be near the root of the tree, and therefore accurately demonstrate its significance in the classification of the user’s playstyle.</w:t>
       </w:r>
     </w:p>
     <w:p/>

</xml_diff>

<commit_message>
report up to implementation
</commit_message>
<xml_diff>
--- a/Design/(4) playstyle_classification.docx
+++ b/Design/(4) playstyle_classification.docx
@@ -277,44 +277,6 @@
       </w:tr>
       <w:tr>
         <w:trPr>
-          <w:trHeight w:val="576"/>
-        </w:trPr>
-        <w:tc>
-          <w:tcPr>
-            <w:tcW w:w="1271" w:type="dxa"/>
-          </w:tcPr>
-          <w:p>
-            <w:r>
-              <w:t>Dribbler (Grounded)</w:t>
-            </w:r>
-          </w:p>
-        </w:tc>
-        <w:tc>
-          <w:tcPr>
-            <w:tcW w:w="4961" w:type="dxa"/>
-          </w:tcPr>
-          <w:p>
-            <w:r>
-              <w:t xml:space="preserve">Time spent on ground, Total carry time, </w:t>
-            </w:r>
-            <w:r>
-              <w:t>Possession time</w:t>
-            </w:r>
-          </w:p>
-        </w:tc>
-        <w:tc>
-          <w:tcPr>
-            <w:tcW w:w="3402" w:type="dxa"/>
-          </w:tcPr>
-          <w:p>
-            <w:r>
-              <w:t>Time spent high in air (low), Time spent near ball</w:t>
-            </w:r>
-          </w:p>
-        </w:tc>
-      </w:tr>
-      <w:tr>
-        <w:trPr>
           <w:trHeight w:val="612"/>
         </w:trPr>
         <w:tc>
@@ -536,26 +498,11 @@
         <w:t>Freestyler</w:t>
       </w:r>
       <w:r>
-        <w:t xml:space="preserve"> is a player who takes many opportunities to perform a highly mechanical play, typically high in the air, in order to outplay the opponents and score themselves, though in higher level </w:t>
+        <w:t xml:space="preserve"> is a player who takes many opportunities to perform a highly mechanical play, typically high in the air, in order to outplay the opponents and score themselves, though in higher level lobbies, these plays can also end up being intentional assists. That is why a Freestyler would typically spend more time high in the air, and less time on the ground than most players, and in many ranks, </w:t>
       </w:r>
       <w:r>
         <w:lastRenderedPageBreak/>
-        <w:t>lobbies, these plays can also end up being intentional assists. That is why a Freestyler would typically spend more time high in the air, and less time on the ground than most players, and in many ranks, prioritising these flashy plays over other important aspects of the game, such as passing, saving, and dribbling.</w:t>
-      </w:r>
-    </w:p>
-    <w:p>
-      <w:r>
-        <w:t xml:space="preserve">A </w:t>
-      </w:r>
-      <w:r>
-        <w:rPr>
-          <w:b/>
-          <w:bCs/>
-        </w:rPr>
-        <w:t>Dribbler</w:t>
-      </w:r>
-      <w:r>
-        <w:t xml:space="preserve"> is in a sense the opposite of a Freestyler, where they typically spend more time on the ground, taking control of the ball to outplay the opponent and use flicks and mind games to attempt to take space and put pressure on the opponents through their high number of options. This leads to a lot of time spent on the ground, a lot of time spent dribbling (carrying) the ball, and maintaining possession.</w:t>
+        <w:t>prioritising these flashy plays over other important aspects of the game, such as passing, saving, and dribbling.</w:t>
       </w:r>
     </w:p>
     <w:p>
@@ -630,6 +577,7 @@
       <w:r>
         <w:t xml:space="preserve">The model I have chosen to use from scikit-learn is </w:t>
       </w:r>
+      <w:proofErr w:type="spellStart"/>
       <w:r>
         <w:rPr>
           <w:b/>
@@ -637,6 +585,7 @@
         </w:rPr>
         <w:t>RandomForestClassifier</w:t>
       </w:r>
+      <w:proofErr w:type="spellEnd"/>
       <w:r>
         <w:t xml:space="preserve">, some of the most important reasons for this choice outside of its reliability and resistance to overfitting, include </w:t>
       </w:r>
@@ -674,7 +623,15 @@
     </w:p>
     <w:p>
       <w:r>
-        <w:t>Another important aspect is Random Forest’s hierarchal design, which is important in the case that the “Rank” feature will be very significant in its effect on every other feature, i.e: time spent high in air indicates freestyler in Diamond much more heavily than in Grand Champ. Its hierarchal design allows for the Rank feature to be near the root of the tree, and therefore accurately demonstrate its significance in the classification of the user’s playstyle.</w:t>
+        <w:t xml:space="preserve">Another important aspect is Random Forest’s hierarchal design, which is important in the case that the “Rank” feature will be very significant in its effect on every other feature, </w:t>
+      </w:r>
+      <w:proofErr w:type="spellStart"/>
+      <w:r>
+        <w:t>i.e</w:t>
+      </w:r>
+      <w:proofErr w:type="spellEnd"/>
+      <w:r>
+        <w:t>: time spent high in air indicates freestyler in Diamond much more heavily than in Grand Champ. Its hierarchal design allows for the Rank feature to be near the root of the tree, and therefore accurately demonstrate its significance in the classification of the user’s playstyle.</w:t>
       </w:r>
     </w:p>
     <w:p/>
@@ -808,7 +765,6 @@
           </w:tcPr>
           <w:p>
             <w:r>
-              <w:lastRenderedPageBreak/>
               <w:t>Not back to defend (</w:t>
             </w:r>
             <w:r>
@@ -899,7 +855,11 @@
           </w:tcPr>
           <w:p>
             <w:r>
-              <w:t>Take more control of the ball for a better shooting opportunity, find a passing opportunity, don’t lose possession for a low percentage shot.</w:t>
+              <w:t xml:space="preserve">Take more control of the ball for a better shooting opportunity, find a passing </w:t>
+            </w:r>
+            <w:r>
+              <w:lastRenderedPageBreak/>
+              <w:t>opportunity, don’t lose possession for a low percentage shot.</w:t>
             </w:r>
           </w:p>
         </w:tc>
@@ -909,6 +869,7 @@
           </w:tcPr>
           <w:p>
             <w:r>
+              <w:lastRenderedPageBreak/>
               <w:t>low shot to goal percentage</w:t>
             </w:r>
           </w:p>
@@ -1271,6 +1232,347 @@
         </w:tc>
       </w:tr>
     </w:tbl>
+    <w:p/>
+    <w:p>
+      <w:pPr>
+        <w:rPr>
+          <w:b/>
+          <w:bCs/>
+        </w:rPr>
+      </w:pPr>
+      <w:r>
+        <w:rPr>
+          <w:b/>
+          <w:bCs/>
+        </w:rPr>
+        <w:t>Ball Chaser</w:t>
+      </w:r>
+    </w:p>
+    <w:tbl>
+      <w:tblPr>
+        <w:tblStyle w:val="TableGrid"/>
+        <w:tblW w:w="0" w:type="auto"/>
+        <w:tblLook w:val="04A0" w:firstRow="1" w:lastRow="0" w:firstColumn="1" w:lastColumn="0" w:noHBand="0" w:noVBand="1"/>
+      </w:tblPr>
+      <w:tblGrid>
+        <w:gridCol w:w="1980"/>
+        <w:gridCol w:w="4819"/>
+        <w:gridCol w:w="2217"/>
+      </w:tblGrid>
+      <w:tr>
+        <w:tc>
+          <w:tcPr>
+            <w:tcW w:w="1980" w:type="dxa"/>
+          </w:tcPr>
+          <w:p>
+            <w:pPr>
+              <w:rPr>
+                <w:b/>
+                <w:bCs/>
+              </w:rPr>
+            </w:pPr>
+            <w:r>
+              <w:rPr>
+                <w:b/>
+                <w:bCs/>
+              </w:rPr>
+              <w:t>Flaw</w:t>
+            </w:r>
+          </w:p>
+        </w:tc>
+        <w:tc>
+          <w:tcPr>
+            <w:tcW w:w="4819" w:type="dxa"/>
+          </w:tcPr>
+          <w:p>
+            <w:pPr>
+              <w:rPr>
+                <w:b/>
+                <w:bCs/>
+              </w:rPr>
+            </w:pPr>
+            <w:r>
+              <w:rPr>
+                <w:b/>
+                <w:bCs/>
+              </w:rPr>
+              <w:t>Advice</w:t>
+            </w:r>
+          </w:p>
+        </w:tc>
+        <w:tc>
+          <w:tcPr>
+            <w:tcW w:w="2217" w:type="dxa"/>
+          </w:tcPr>
+          <w:p>
+            <w:pPr>
+              <w:rPr>
+                <w:b/>
+                <w:bCs/>
+              </w:rPr>
+            </w:pPr>
+            <w:r>
+              <w:rPr>
+                <w:b/>
+                <w:bCs/>
+              </w:rPr>
+              <w:t>Evidence</w:t>
+            </w:r>
+          </w:p>
+        </w:tc>
+      </w:tr>
+      <w:tr>
+        <w:tc>
+          <w:tcPr>
+            <w:tcW w:w="1980" w:type="dxa"/>
+          </w:tcPr>
+          <w:p>
+            <w:r>
+              <w:t>Causing double commits by breaking rotation (</w:t>
+            </w:r>
+            <w:r>
+              <w:rPr>
+                <w:b/>
+                <w:bCs/>
+              </w:rPr>
+              <w:t>Interviews 2, 3</w:t>
+            </w:r>
+            <w:r>
+              <w:t>)</w:t>
+            </w:r>
+          </w:p>
+        </w:tc>
+        <w:tc>
+          <w:tcPr>
+            <w:tcW w:w="4819" w:type="dxa"/>
+          </w:tcPr>
+          <w:p>
+            <w:r>
+              <w:t xml:space="preserve">Ensure when chasing the ball that your teammates don’t have a better play on it, or clearly intend to go for it, to avoid causing double commits or suboptimal plays.  </w:t>
+            </w:r>
+          </w:p>
+        </w:tc>
+        <w:tc>
+          <w:tcPr>
+            <w:tcW w:w="2217" w:type="dxa"/>
+          </w:tcPr>
+          <w:p>
+            <w:r>
+              <w:t>Low average distance to teammates</w:t>
+            </w:r>
+          </w:p>
+        </w:tc>
+      </w:tr>
+      <w:tr>
+        <w:tc>
+          <w:tcPr>
+            <w:tcW w:w="1980" w:type="dxa"/>
+          </w:tcPr>
+          <w:p>
+            <w:r>
+              <w:t>Breaking rotation can cause confusion</w:t>
+            </w:r>
+            <w:r>
+              <w:t xml:space="preserve"> (</w:t>
+            </w:r>
+            <w:r>
+              <w:rPr>
+                <w:b/>
+                <w:bCs/>
+              </w:rPr>
+              <w:t>Interview 2</w:t>
+            </w:r>
+            <w:r>
+              <w:t>)</w:t>
+            </w:r>
+          </w:p>
+        </w:tc>
+        <w:tc>
+          <w:tcPr>
+            <w:tcW w:w="4819" w:type="dxa"/>
+          </w:tcPr>
+          <w:p>
+            <w:r>
+              <w:t>Although ball chasing is at times useful and even necessary, doing so too often when it is not required can cause overall confusion on the team since you are usually out of position doing so.</w:t>
+            </w:r>
+          </w:p>
+        </w:tc>
+        <w:tc>
+          <w:tcPr>
+            <w:tcW w:w="2217" w:type="dxa"/>
+          </w:tcPr>
+          <w:p>
+            <w:r>
+              <w:t>Too high closest to ball %.</w:t>
+            </w:r>
+          </w:p>
+        </w:tc>
+      </w:tr>
+    </w:tbl>
+    <w:p/>
+    <w:p>
+      <w:pPr>
+        <w:rPr>
+          <w:b/>
+          <w:bCs/>
+        </w:rPr>
+      </w:pPr>
+      <w:r>
+        <w:rPr>
+          <w:b/>
+          <w:bCs/>
+        </w:rPr>
+        <w:t>Defender</w:t>
+      </w:r>
+    </w:p>
+    <w:tbl>
+      <w:tblPr>
+        <w:tblStyle w:val="TableGrid"/>
+        <w:tblW w:w="0" w:type="auto"/>
+        <w:tblLook w:val="04A0" w:firstRow="1" w:lastRow="0" w:firstColumn="1" w:lastColumn="0" w:noHBand="0" w:noVBand="1"/>
+      </w:tblPr>
+      <w:tblGrid>
+        <w:gridCol w:w="1980"/>
+        <w:gridCol w:w="4252"/>
+        <w:gridCol w:w="2784"/>
+      </w:tblGrid>
+      <w:tr>
+        <w:tc>
+          <w:tcPr>
+            <w:tcW w:w="1980" w:type="dxa"/>
+          </w:tcPr>
+          <w:p>
+            <w:pPr>
+              <w:rPr>
+                <w:b/>
+                <w:bCs/>
+              </w:rPr>
+            </w:pPr>
+            <w:r>
+              <w:rPr>
+                <w:b/>
+                <w:bCs/>
+              </w:rPr>
+              <w:t>Flaw</w:t>
+            </w:r>
+          </w:p>
+        </w:tc>
+        <w:tc>
+          <w:tcPr>
+            <w:tcW w:w="4252" w:type="dxa"/>
+          </w:tcPr>
+          <w:p>
+            <w:pPr>
+              <w:rPr>
+                <w:b/>
+                <w:bCs/>
+              </w:rPr>
+            </w:pPr>
+            <w:r>
+              <w:rPr>
+                <w:b/>
+                <w:bCs/>
+              </w:rPr>
+              <w:t>Advice</w:t>
+            </w:r>
+          </w:p>
+        </w:tc>
+        <w:tc>
+          <w:tcPr>
+            <w:tcW w:w="2784" w:type="dxa"/>
+          </w:tcPr>
+          <w:p>
+            <w:pPr>
+              <w:rPr>
+                <w:b/>
+                <w:bCs/>
+              </w:rPr>
+            </w:pPr>
+            <w:r>
+              <w:rPr>
+                <w:b/>
+                <w:bCs/>
+              </w:rPr>
+              <w:t>Evidence</w:t>
+            </w:r>
+          </w:p>
+        </w:tc>
+      </w:tr>
+      <w:tr>
+        <w:tc>
+          <w:tcPr>
+            <w:tcW w:w="1980" w:type="dxa"/>
+          </w:tcPr>
+          <w:p>
+            <w:r>
+              <w:t>Not involved in offensive plays enough (</w:t>
+            </w:r>
+            <w:r>
+              <w:rPr>
+                <w:b/>
+                <w:bCs/>
+              </w:rPr>
+              <w:t>Interview 1</w:t>
+            </w:r>
+            <w:r>
+              <w:t>)</w:t>
+            </w:r>
+          </w:p>
+        </w:tc>
+        <w:tc>
+          <w:tcPr>
+            <w:tcW w:w="4252" w:type="dxa"/>
+          </w:tcPr>
+          <w:p>
+            <w:r>
+              <w:t xml:space="preserve">By rotating back too early on offensive plays, you can miss chances to let your first man cover clears and allow you to become involved in supporting the attack and maintaining pressure. </w:t>
+            </w:r>
+          </w:p>
+        </w:tc>
+        <w:tc>
+          <w:tcPr>
+            <w:tcW w:w="2784" w:type="dxa"/>
+          </w:tcPr>
+          <w:p>
+            <w:r>
+              <w:t>High % time in defensive third, high average distance from ball</w:t>
+            </w:r>
+          </w:p>
+        </w:tc>
+      </w:tr>
+      <w:tr>
+        <w:tc>
+          <w:tcPr>
+            <w:tcW w:w="1980" w:type="dxa"/>
+          </w:tcPr>
+          <w:p>
+            <w:r>
+              <w:t>Giving away ball when could take control</w:t>
+            </w:r>
+          </w:p>
+        </w:tc>
+        <w:tc>
+          <w:tcPr>
+            <w:tcW w:w="4252" w:type="dxa"/>
+          </w:tcPr>
+          <w:p>
+            <w:r>
+              <w:t>May be missing opportunities to take control of the ball, where you can clear it without giving away possession.</w:t>
+            </w:r>
+          </w:p>
+        </w:tc>
+        <w:tc>
+          <w:tcPr>
+            <w:tcW w:w="2784" w:type="dxa"/>
+          </w:tcPr>
+          <w:p>
+            <w:r>
+              <w:t>Low possession time, high distance from ball, low carry time, many clears</w:t>
+            </w:r>
+          </w:p>
+        </w:tc>
+      </w:tr>
+    </w:tbl>
     <w:p>
       <w:pPr>
         <w:rPr>
@@ -1291,7 +1593,7 @@
           <w:b/>
           <w:bCs/>
         </w:rPr>
-        <w:t>Dribbler</w:t>
+        <w:t>Playmaker</w:t>
       </w:r>
     </w:p>
     <w:tbl>
@@ -1317,7 +1619,6 @@
                 <w:bCs/>
               </w:rPr>
             </w:pPr>
-            <w:bookmarkStart w:id="0" w:name="_Hlk215342819"/>
             <w:r>
               <w:rPr>
                 <w:b/>
@@ -1375,7 +1676,10 @@
           </w:tcPr>
           <w:p>
             <w:r>
-              <w:t>Taking time when there isn’t any (</w:t>
+              <w:t>Passes</w:t>
+            </w:r>
+            <w:r>
+              <w:t xml:space="preserve"> are risky, can be intercepted (</w:t>
             </w:r>
             <w:r>
               <w:rPr>
@@ -1387,6 +1691,9 @@
             <w:r>
               <w:t>)</w:t>
             </w:r>
+            <w:r>
+              <w:t xml:space="preserve"> </w:t>
+            </w:r>
           </w:p>
         </w:tc>
         <w:tc>
@@ -1395,7 +1702,10 @@
           </w:tcPr>
           <w:p>
             <w:r>
-              <w:t xml:space="preserve">Trying to take time too often can also be an issue, can lead to unfavourable 50/50’s and giving away possession in your own half. </w:t>
+              <w:t>By trying to force a pass when it is unnecessary or you don’t have a teammate ready for it, you may end up committing 2 players if the pass ends up in the opponent’s hands.</w:t>
+            </w:r>
+            <w:r>
+              <w:t xml:space="preserve"> </w:t>
             </w:r>
           </w:p>
         </w:tc>
@@ -1405,7 +1715,7 @@
           </w:tcPr>
           <w:p>
             <w:r>
-              <w:t>Low average carry time</w:t>
+              <w:t xml:space="preserve">Have not found suitable statistics, may have to be prefaced as general advice. </w:t>
             </w:r>
           </w:p>
         </w:tc>
@@ -1416,18 +1726,21 @@
             <w:tcW w:w="1980" w:type="dxa"/>
           </w:tcPr>
           <w:p>
-            <w:r>
-              <w:t>Not taking aerial opportunities (</w:t>
-            </w:r>
-            <w:r>
-              <w:rPr>
-                <w:b/>
-                <w:bCs/>
-              </w:rPr>
-              <w:t>Interview 3</w:t>
-            </w:r>
-            <w:r>
-              <w:t>)</w:t>
+            <w:pPr>
+              <w:rPr>
+                <w:b/>
+                <w:bCs/>
+              </w:rPr>
+            </w:pPr>
+            <w:r>
+              <w:t>Not taking better opportunities to shoot (</w:t>
+            </w:r>
+            <w:r>
+              <w:rPr>
+                <w:b/>
+                <w:bCs/>
+              </w:rPr>
+              <w:t>Interview 3)</w:t>
             </w:r>
           </w:p>
         </w:tc>
@@ -1437,7 +1750,7 @@
           </w:tcPr>
           <w:p>
             <w:r>
-              <w:t>Utilising the air can open up many more options, even if it isn’t anything flashy. By always beginning with a ground play, you limit your options in the air.</w:t>
+              <w:t>Passing the ball is not always better than simply shooting and sometimes shooting and forcing an awkward save can be a better type of pass than a direct one.</w:t>
             </w:r>
           </w:p>
         </w:tc>
@@ -1447,359 +1760,7 @@
           </w:tcPr>
           <w:p>
             <w:r>
-              <w:t>Little time spent in the air</w:t>
-            </w:r>
-          </w:p>
-        </w:tc>
-      </w:tr>
-      <w:bookmarkEnd w:id="0"/>
-    </w:tbl>
-    <w:p/>
-    <w:p>
-      <w:pPr>
-        <w:rPr>
-          <w:b/>
-          <w:bCs/>
-        </w:rPr>
-      </w:pPr>
-      <w:r>
-        <w:rPr>
-          <w:b/>
-          <w:bCs/>
-        </w:rPr>
-        <w:t>Ball Chaser</w:t>
-      </w:r>
-    </w:p>
-    <w:tbl>
-      <w:tblPr>
-        <w:tblStyle w:val="TableGrid"/>
-        <w:tblW w:w="0" w:type="auto"/>
-        <w:tblLook w:val="04A0" w:firstRow="1" w:lastRow="0" w:firstColumn="1" w:lastColumn="0" w:noHBand="0" w:noVBand="1"/>
-      </w:tblPr>
-      <w:tblGrid>
-        <w:gridCol w:w="1980"/>
-        <w:gridCol w:w="4819"/>
-        <w:gridCol w:w="2217"/>
-      </w:tblGrid>
-      <w:tr>
-        <w:tc>
-          <w:tcPr>
-            <w:tcW w:w="1980" w:type="dxa"/>
-          </w:tcPr>
-          <w:p>
-            <w:pPr>
-              <w:rPr>
-                <w:b/>
-                <w:bCs/>
-              </w:rPr>
-            </w:pPr>
-            <w:r>
-              <w:rPr>
-                <w:b/>
-                <w:bCs/>
-              </w:rPr>
-              <w:t>Flaw</w:t>
-            </w:r>
-          </w:p>
-        </w:tc>
-        <w:tc>
-          <w:tcPr>
-            <w:tcW w:w="4819" w:type="dxa"/>
-          </w:tcPr>
-          <w:p>
-            <w:pPr>
-              <w:rPr>
-                <w:b/>
-                <w:bCs/>
-              </w:rPr>
-            </w:pPr>
-            <w:r>
-              <w:rPr>
-                <w:b/>
-                <w:bCs/>
-              </w:rPr>
-              <w:t>Advice</w:t>
-            </w:r>
-          </w:p>
-        </w:tc>
-        <w:tc>
-          <w:tcPr>
-            <w:tcW w:w="2217" w:type="dxa"/>
-          </w:tcPr>
-          <w:p>
-            <w:pPr>
-              <w:rPr>
-                <w:b/>
-                <w:bCs/>
-              </w:rPr>
-            </w:pPr>
-            <w:r>
-              <w:rPr>
-                <w:b/>
-                <w:bCs/>
-              </w:rPr>
-              <w:t>Evidence</w:t>
-            </w:r>
-          </w:p>
-        </w:tc>
-      </w:tr>
-      <w:tr>
-        <w:tc>
-          <w:tcPr>
-            <w:tcW w:w="1980" w:type="dxa"/>
-          </w:tcPr>
-          <w:p>
-            <w:r>
-              <w:t xml:space="preserve">Causing double commits by </w:t>
-            </w:r>
-            <w:r>
-              <w:lastRenderedPageBreak/>
-              <w:t>breaking rotation (</w:t>
-            </w:r>
-            <w:r>
-              <w:rPr>
-                <w:b/>
-                <w:bCs/>
-              </w:rPr>
-              <w:t>Interviews 2, 3</w:t>
-            </w:r>
-            <w:r>
-              <w:t>)</w:t>
-            </w:r>
-          </w:p>
-        </w:tc>
-        <w:tc>
-          <w:tcPr>
-            <w:tcW w:w="4819" w:type="dxa"/>
-          </w:tcPr>
-          <w:p>
-            <w:r>
-              <w:lastRenderedPageBreak/>
-              <w:t xml:space="preserve">Ensure when chasing the ball that your teammates don’t have a better play on it, or clearly intend to </w:t>
-            </w:r>
-            <w:r>
-              <w:lastRenderedPageBreak/>
-              <w:t xml:space="preserve">go for it, to avoid causing double commits or suboptimal plays.  </w:t>
-            </w:r>
-          </w:p>
-        </w:tc>
-        <w:tc>
-          <w:tcPr>
-            <w:tcW w:w="2217" w:type="dxa"/>
-          </w:tcPr>
-          <w:p>
-            <w:r>
-              <w:lastRenderedPageBreak/>
-              <w:t>Low average distance to teammates</w:t>
-            </w:r>
-          </w:p>
-        </w:tc>
-      </w:tr>
-      <w:tr>
-        <w:tc>
-          <w:tcPr>
-            <w:tcW w:w="1980" w:type="dxa"/>
-          </w:tcPr>
-          <w:p>
-            <w:r>
-              <w:t>Breaking rotation can cause confusion</w:t>
-            </w:r>
-            <w:r>
-              <w:t xml:space="preserve"> (</w:t>
-            </w:r>
-            <w:r>
-              <w:rPr>
-                <w:b/>
-                <w:bCs/>
-              </w:rPr>
-              <w:t>Interview 2</w:t>
-            </w:r>
-            <w:r>
-              <w:t>)</w:t>
-            </w:r>
-          </w:p>
-        </w:tc>
-        <w:tc>
-          <w:tcPr>
-            <w:tcW w:w="4819" w:type="dxa"/>
-          </w:tcPr>
-          <w:p>
-            <w:r>
-              <w:t>Although ball chasing is at times useful and even necessary, doing so too often when it is not required can cause overall confusion on the team since you are usually out of position doing so.</w:t>
-            </w:r>
-          </w:p>
-        </w:tc>
-        <w:tc>
-          <w:tcPr>
-            <w:tcW w:w="2217" w:type="dxa"/>
-          </w:tcPr>
-          <w:p>
-            <w:r>
-              <w:t>Too high closest to ball %.</w:t>
-            </w:r>
-          </w:p>
-        </w:tc>
-      </w:tr>
-    </w:tbl>
-    <w:p/>
-    <w:p>
-      <w:pPr>
-        <w:rPr>
-          <w:b/>
-          <w:bCs/>
-        </w:rPr>
-      </w:pPr>
-      <w:r>
-        <w:rPr>
-          <w:b/>
-          <w:bCs/>
-        </w:rPr>
-        <w:t>Defender</w:t>
-      </w:r>
-    </w:p>
-    <w:tbl>
-      <w:tblPr>
-        <w:tblStyle w:val="TableGrid"/>
-        <w:tblW w:w="0" w:type="auto"/>
-        <w:tblLook w:val="04A0" w:firstRow="1" w:lastRow="0" w:firstColumn="1" w:lastColumn="0" w:noHBand="0" w:noVBand="1"/>
-      </w:tblPr>
-      <w:tblGrid>
-        <w:gridCol w:w="1980"/>
-        <w:gridCol w:w="4252"/>
-        <w:gridCol w:w="2784"/>
-      </w:tblGrid>
-      <w:tr>
-        <w:tc>
-          <w:tcPr>
-            <w:tcW w:w="1980" w:type="dxa"/>
-          </w:tcPr>
-          <w:p>
-            <w:pPr>
-              <w:rPr>
-                <w:b/>
-                <w:bCs/>
-              </w:rPr>
-            </w:pPr>
-            <w:r>
-              <w:rPr>
-                <w:b/>
-                <w:bCs/>
-              </w:rPr>
-              <w:t>Flaw</w:t>
-            </w:r>
-          </w:p>
-        </w:tc>
-        <w:tc>
-          <w:tcPr>
-            <w:tcW w:w="4252" w:type="dxa"/>
-          </w:tcPr>
-          <w:p>
-            <w:pPr>
-              <w:rPr>
-                <w:b/>
-                <w:bCs/>
-              </w:rPr>
-            </w:pPr>
-            <w:r>
-              <w:rPr>
-                <w:b/>
-                <w:bCs/>
-              </w:rPr>
-              <w:t>Advice</w:t>
-            </w:r>
-          </w:p>
-        </w:tc>
-        <w:tc>
-          <w:tcPr>
-            <w:tcW w:w="2784" w:type="dxa"/>
-          </w:tcPr>
-          <w:p>
-            <w:pPr>
-              <w:rPr>
-                <w:b/>
-                <w:bCs/>
-              </w:rPr>
-            </w:pPr>
-            <w:r>
-              <w:rPr>
-                <w:b/>
-                <w:bCs/>
-              </w:rPr>
-              <w:t>Evidence</w:t>
-            </w:r>
-          </w:p>
-        </w:tc>
-      </w:tr>
-      <w:tr>
-        <w:tc>
-          <w:tcPr>
-            <w:tcW w:w="1980" w:type="dxa"/>
-          </w:tcPr>
-          <w:p>
-            <w:r>
-              <w:t>Not involved in offensive plays enough (</w:t>
-            </w:r>
-            <w:r>
-              <w:rPr>
-                <w:b/>
-                <w:bCs/>
-              </w:rPr>
-              <w:t>Interview 1</w:t>
-            </w:r>
-            <w:r>
-              <w:t>)</w:t>
-            </w:r>
-          </w:p>
-        </w:tc>
-        <w:tc>
-          <w:tcPr>
-            <w:tcW w:w="4252" w:type="dxa"/>
-          </w:tcPr>
-          <w:p>
-            <w:r>
-              <w:t xml:space="preserve">By rotating back too early on offensive plays, you can miss chances to let your first man cover clears and allow you to become involved in supporting the attack and maintaining pressure. </w:t>
-            </w:r>
-          </w:p>
-        </w:tc>
-        <w:tc>
-          <w:tcPr>
-            <w:tcW w:w="2784" w:type="dxa"/>
-          </w:tcPr>
-          <w:p>
-            <w:r>
-              <w:t>High % time in defensive third, high average distance from ball</w:t>
-            </w:r>
-          </w:p>
-        </w:tc>
-      </w:tr>
-      <w:tr>
-        <w:tc>
-          <w:tcPr>
-            <w:tcW w:w="1980" w:type="dxa"/>
-          </w:tcPr>
-          <w:p>
-            <w:r>
-              <w:t>Giving away ball when could take control</w:t>
-            </w:r>
-          </w:p>
-        </w:tc>
-        <w:tc>
-          <w:tcPr>
-            <w:tcW w:w="4252" w:type="dxa"/>
-          </w:tcPr>
-          <w:p>
-            <w:r>
-              <w:t>May be missing opportunities to take control of the ball, where you can clear it without giving away possession.</w:t>
-            </w:r>
-          </w:p>
-        </w:tc>
-        <w:tc>
-          <w:tcPr>
-            <w:tcW w:w="2784" w:type="dxa"/>
-          </w:tcPr>
-          <w:p>
-            <w:r>
-              <w:t>Low possession time, high distance from ball, low carry time, many clears</w:t>
+              <w:t>Low shots</w:t>
             </w:r>
           </w:p>
         </w:tc>
@@ -1818,294 +1779,100 @@
         <w:rPr>
           <w:b/>
           <w:bCs/>
+          <w:sz w:val="24"/>
+          <w:szCs w:val="24"/>
         </w:rPr>
       </w:pPr>
       <w:r>
         <w:rPr>
           <w:b/>
           <w:bCs/>
-        </w:rPr>
-        <w:t>Playmaker</w:t>
-      </w:r>
-    </w:p>
-    <w:tbl>
-      <w:tblPr>
-        <w:tblStyle w:val="TableGrid"/>
-        <w:tblW w:w="0" w:type="auto"/>
-        <w:tblLook w:val="04A0" w:firstRow="1" w:lastRow="0" w:firstColumn="1" w:lastColumn="0" w:noHBand="0" w:noVBand="1"/>
-      </w:tblPr>
-      <w:tblGrid>
-        <w:gridCol w:w="1980"/>
-        <w:gridCol w:w="4536"/>
-        <w:gridCol w:w="2500"/>
-      </w:tblGrid>
-      <w:tr>
-        <w:tc>
-          <w:tcPr>
-            <w:tcW w:w="1980" w:type="dxa"/>
-          </w:tcPr>
-          <w:p>
-            <w:pPr>
-              <w:rPr>
-                <w:b/>
-                <w:bCs/>
-              </w:rPr>
-            </w:pPr>
-            <w:r>
-              <w:rPr>
-                <w:b/>
-                <w:bCs/>
-              </w:rPr>
-              <w:t>Flaw</w:t>
-            </w:r>
-          </w:p>
-        </w:tc>
-        <w:tc>
-          <w:tcPr>
-            <w:tcW w:w="4536" w:type="dxa"/>
-          </w:tcPr>
-          <w:p>
-            <w:pPr>
-              <w:rPr>
-                <w:b/>
-                <w:bCs/>
-              </w:rPr>
-            </w:pPr>
-            <w:r>
-              <w:rPr>
-                <w:b/>
-                <w:bCs/>
-              </w:rPr>
-              <w:t>Advice</w:t>
-            </w:r>
-          </w:p>
-        </w:tc>
-        <w:tc>
-          <w:tcPr>
-            <w:tcW w:w="2500" w:type="dxa"/>
-          </w:tcPr>
-          <w:p>
-            <w:pPr>
-              <w:rPr>
-                <w:b/>
-                <w:bCs/>
-              </w:rPr>
-            </w:pPr>
-            <w:r>
-              <w:rPr>
-                <w:b/>
-                <w:bCs/>
-              </w:rPr>
-              <w:t>Evidence</w:t>
-            </w:r>
-          </w:p>
-        </w:tc>
-      </w:tr>
-      <w:tr>
-        <w:tc>
-          <w:tcPr>
-            <w:tcW w:w="1980" w:type="dxa"/>
-          </w:tcPr>
-          <w:p>
-            <w:r>
-              <w:t>Passes</w:t>
-            </w:r>
-            <w:r>
-              <w:t xml:space="preserve"> are risky, can be intercepted (</w:t>
-            </w:r>
-            <w:r>
-              <w:rPr>
-                <w:b/>
-                <w:bCs/>
-              </w:rPr>
-              <w:t>Interview 3</w:t>
-            </w:r>
-            <w:r>
-              <w:t>)</w:t>
-            </w:r>
-            <w:r>
-              <w:t xml:space="preserve"> </w:t>
-            </w:r>
-          </w:p>
-        </w:tc>
-        <w:tc>
-          <w:tcPr>
-            <w:tcW w:w="4536" w:type="dxa"/>
-          </w:tcPr>
-          <w:p>
-            <w:r>
-              <w:t>By trying to force a pass when it is unnecessary or you don’t have a teammate ready for it, you may end up committing 2 players if the pass ends up in the opponent’s hands.</w:t>
-            </w:r>
-            <w:r>
-              <w:t xml:space="preserve"> </w:t>
-            </w:r>
-          </w:p>
-        </w:tc>
-        <w:tc>
-          <w:tcPr>
-            <w:tcW w:w="2500" w:type="dxa"/>
-          </w:tcPr>
-          <w:p>
-            <w:r>
-              <w:t xml:space="preserve">Have not found suitable statistics, may have to be prefaced as general advice. </w:t>
-            </w:r>
-          </w:p>
-        </w:tc>
-      </w:tr>
-      <w:tr>
-        <w:tc>
-          <w:tcPr>
-            <w:tcW w:w="1980" w:type="dxa"/>
-          </w:tcPr>
-          <w:p>
-            <w:pPr>
-              <w:rPr>
-                <w:b/>
-                <w:bCs/>
-              </w:rPr>
-            </w:pPr>
-            <w:r>
-              <w:t>Not taking better opportunities to shoot (</w:t>
-            </w:r>
-            <w:r>
-              <w:rPr>
-                <w:b/>
-                <w:bCs/>
-              </w:rPr>
-              <w:t>Interview 3)</w:t>
-            </w:r>
-          </w:p>
-        </w:tc>
-        <w:tc>
-          <w:tcPr>
-            <w:tcW w:w="4536" w:type="dxa"/>
-          </w:tcPr>
-          <w:p>
-            <w:r>
-              <w:t>Passing the ball is not always better than simply shooting and sometimes shooting and forcing an awkward save can be a better type of pass than a direct one.</w:t>
-            </w:r>
-          </w:p>
-        </w:tc>
-        <w:tc>
-          <w:tcPr>
-            <w:tcW w:w="2500" w:type="dxa"/>
-          </w:tcPr>
-          <w:p>
-            <w:r>
-              <w:t>Low shots</w:t>
-            </w:r>
-          </w:p>
-        </w:tc>
-      </w:tr>
-    </w:tbl>
-    <w:p>
-      <w:pPr>
-        <w:rPr>
-          <w:b/>
-          <w:bCs/>
-        </w:rPr>
-      </w:pPr>
+          <w:sz w:val="24"/>
+          <w:szCs w:val="24"/>
+        </w:rPr>
+        <w:t>4.4 Labelling strategies</w:t>
+      </w:r>
     </w:p>
     <w:p>
-      <w:pPr>
-        <w:rPr>
-          <w:b/>
-          <w:bCs/>
-          <w:sz w:val="24"/>
-          <w:szCs w:val="24"/>
-        </w:rPr>
-      </w:pPr>
-      <w:r>
-        <w:rPr>
-          <w:b/>
-          <w:bCs/>
-          <w:sz w:val="24"/>
-          <w:szCs w:val="24"/>
-        </w:rPr>
-        <w:t>4.4 Labelling strategies</w:t>
+      <w:r>
+        <w:t xml:space="preserve">For the model to be able to learn to classify the data, the data must somehow be labelled. However, since the classification of a playstyle is ultimately a subjective decision based on tendencies and statistics, the only realistic way to acquire these labels is to do so manually. This part will explain the details of how I will aim to do so to meet </w:t>
+      </w:r>
+      <w:r>
+        <w:rPr>
+          <w:b/>
+          <w:bCs/>
+          <w:u w:val="single"/>
+        </w:rPr>
+        <w:t>Requirement 1.3.3</w:t>
+      </w:r>
+      <w:r>
+        <w:t xml:space="preserve">, while trying to achieve the highest accuracy possible </w:t>
+      </w:r>
+      <w:r>
+        <w:t>to</w:t>
+      </w:r>
+      <w:r>
+        <w:t xml:space="preserve"> align with </w:t>
+      </w:r>
+      <w:r>
+        <w:rPr>
+          <w:b/>
+          <w:bCs/>
+          <w:u w:val="single"/>
+        </w:rPr>
+        <w:t>Requirement 2.3.2</w:t>
+      </w:r>
+      <w:r>
+        <w:t>.</w:t>
       </w:r>
     </w:p>
     <w:p>
       <w:r>
-        <w:t xml:space="preserve">For the model to be able to learn to classify the data, the data must somehow be labelled. However, since the classification of a playstyle is ultimately a subjective decision based on tendencies and statistics, the only realistic way to acquire these labels is to do so manually. This part will explain the details of how I will aim to do so to meet </w:t>
-      </w:r>
-      <w:r>
-        <w:rPr>
-          <w:b/>
-          <w:bCs/>
-          <w:u w:val="single"/>
-        </w:rPr>
-        <w:t>Requirement 1.3.3</w:t>
-      </w:r>
-      <w:r>
-        <w:t xml:space="preserve">, while trying to achieve the highest accuracy possible </w:t>
-      </w:r>
-      <w:r>
-        <w:t>to</w:t>
-      </w:r>
-      <w:r>
-        <w:t xml:space="preserve"> align with </w:t>
-      </w:r>
-      <w:r>
-        <w:rPr>
-          <w:b/>
-          <w:bCs/>
-          <w:u w:val="single"/>
-        </w:rPr>
-        <w:t>Requirement 2.3.2</w:t>
-      </w:r>
-      <w:r>
-        <w:t>.</w:t>
+        <w:t>To make this process as quick as possible</w:t>
+      </w:r>
+      <w:r>
+        <w:t xml:space="preserve"> (as to allow for as much training data as possible)</w:t>
+      </w:r>
+      <w:r>
+        <w:t xml:space="preserve">, I aim to create a </w:t>
+      </w:r>
+      <w:r>
+        <w:rPr>
+          <w:b/>
+          <w:bCs/>
+        </w:rPr>
+        <w:t>mini application</w:t>
+      </w:r>
+      <w:r>
+        <w:t xml:space="preserve"> </w:t>
+      </w:r>
+      <w:r>
+        <w:t xml:space="preserve">(labeller) </w:t>
+      </w:r>
+      <w:r>
+        <w:t xml:space="preserve">that allows me to analyse relevant statistics of a single player, and simply click the button corresponding to the </w:t>
+      </w:r>
+      <w:r>
+        <w:t>playstyle I decide</w:t>
+      </w:r>
+      <w:r>
+        <w:t>, which will automatically insert the data with the chosen playstyle label into the training dataset</w:t>
+      </w:r>
+      <w:r>
+        <w:t>, in order</w:t>
+      </w:r>
+      <w:r>
+        <w:t xml:space="preserve"> remove the need to write it down manually and read the data in an unintuitive spreadsheet.</w:t>
       </w:r>
     </w:p>
     <w:p>
       <w:r>
-        <w:t>To make this process as quick as possible</w:t>
-      </w:r>
-      <w:r>
-        <w:t xml:space="preserve"> (as to allow for as much training data as possible)</w:t>
-      </w:r>
-      <w:r>
-        <w:t xml:space="preserve">, I aim to create a </w:t>
-      </w:r>
-      <w:r>
-        <w:rPr>
-          <w:b/>
-          <w:bCs/>
-        </w:rPr>
-        <w:t>mini application</w:t>
-      </w:r>
-      <w:r>
-        <w:t xml:space="preserve"> </w:t>
-      </w:r>
-      <w:r>
-        <w:t xml:space="preserve">(labeller) </w:t>
-      </w:r>
-      <w:r>
-        <w:t xml:space="preserve">that allows me to analyse relevant statistics of a single player, and simply click the button corresponding to the </w:t>
-      </w:r>
-      <w:r>
-        <w:t>playstyle I decide</w:t>
-      </w:r>
-      <w:r>
-        <w:t>, which will automatically insert the data with the chosen playstyle label into the training dataset</w:t>
-      </w:r>
-      <w:r>
-        <w:t>, in order</w:t>
-      </w:r>
-      <w:r>
-        <w:t xml:space="preserve"> remove the need to write it down manually and read the data in an unintuitive spreadsheet.</w:t>
-      </w:r>
-    </w:p>
-    <w:p>
-      <w:r>
         <w:t xml:space="preserve">Due to the high amount of data that will need to be analysed, it will be difficult for me to judge a set of values until I have seen many and built up a general understanding of how an average player’s </w:t>
       </w:r>
       <w:r>
         <w:rPr>
           <w:noProof/>
         </w:rPr>
-        <w:lastRenderedPageBreak/>
         <w:drawing>
           <wp:anchor distT="0" distB="0" distL="114300" distR="114300" simplePos="0" relativeHeight="251658240" behindDoc="0" locked="0" layoutInCell="1" allowOverlap="1" wp14:anchorId="44FB4FD3" wp14:editId="6AEF2DF3">
             <wp:simplePos x="0" y="0"/>
@@ -2206,6 +1973,7 @@
     </w:p>
     <w:p>
       <w:r>
+        <w:lastRenderedPageBreak/>
         <w:t xml:space="preserve">The general idea can be visualised with the following image, with implementation including all specific statistics and playstyles. Note the bar with different colours is included to make judging the percentiles quicker and </w:t>
       </w:r>
       <w:r>

</xml_diff>